<commit_message>
Replace infographic design with text-only version in template
Co-Authored-By: Claude Opus 5.5 <noreply@anthropic.com>
Claude-Session: https://claude.ai/code/session_01CuowyRKknHJcUbt9phQMxj
</commit_message>
<xml_diff>
--- a/HMGT327_Assignment1_Stakeholder_Management.docx
+++ b/HMGT327_Assignment1_Stakeholder_Management.docx
@@ -311,93 +311,7 @@
     </w:p>
     <w:p>
       <w:pPr>
-        <w:spacing w:after="0" w:before="0" w:line="276" w:lineRule="auto"/>
-        <w:jc w:val="center"/>
-      </w:pPr>
-      <w:r>
-        <w:drawing>
-          <wp:inline xmlns:a="http://schemas.openxmlformats.org/drawingml/2006/main" xmlns:pic="http://schemas.openxmlformats.org/drawingml/2006/picture">
-            <wp:extent cx="5852160" cy="8274954"/>
-            <wp:docPr id="1" name="Picture 1"/>
-            <wp:cNvGraphicFramePr>
-              <a:graphicFrameLocks noChangeAspect="1"/>
-            </wp:cNvGraphicFramePr>
-            <a:graphic>
-              <a:graphicData uri="http://schemas.openxmlformats.org/drawingml/2006/picture">
-                <pic:pic>
-                  <pic:nvPicPr>
-                    <pic:cNvPr id="0" name="p1.png"/>
-                    <pic:cNvPicPr/>
-                  </pic:nvPicPr>
-                  <pic:blipFill>
-                    <a:blip r:embed="rId14"/>
-                    <a:stretch>
-                      <a:fillRect/>
-                    </a:stretch>
-                  </pic:blipFill>
-                  <pic:spPr>
-                    <a:xfrm>
-                      <a:off x="0" y="0"/>
-                      <a:ext cx="5852160" cy="8274954"/>
-                    </a:xfrm>
-                    <a:prstGeom prst="rect"/>
-                  </pic:spPr>
-                </pic:pic>
-              </a:graphicData>
-            </a:graphic>
-          </wp:inline>
-        </w:drawing>
-      </w:r>
-      <w:r>
-        <w:br w:type="page"/>
-      </w:r>
-    </w:p>
-    <w:p>
-      <w:pPr>
-        <w:spacing w:after="0" w:before="0" w:line="276" w:lineRule="auto"/>
-        <w:jc w:val="center"/>
-      </w:pPr>
-      <w:r>
-        <w:drawing>
-          <wp:inline xmlns:a="http://schemas.openxmlformats.org/drawingml/2006/main" xmlns:pic="http://schemas.openxmlformats.org/drawingml/2006/picture">
-            <wp:extent cx="5852160" cy="7783373"/>
-            <wp:docPr id="2" name="Picture 2"/>
-            <wp:cNvGraphicFramePr>
-              <a:graphicFrameLocks noChangeAspect="1"/>
-            </wp:cNvGraphicFramePr>
-            <a:graphic>
-              <a:graphicData uri="http://schemas.openxmlformats.org/drawingml/2006/picture">
-                <pic:pic>
-                  <pic:nvPicPr>
-                    <pic:cNvPr id="0" name="p2.png"/>
-                    <pic:cNvPicPr/>
-                  </pic:nvPicPr>
-                  <pic:blipFill>
-                    <a:blip r:embed="rId15"/>
-                    <a:stretch>
-                      <a:fillRect/>
-                    </a:stretch>
-                  </pic:blipFill>
-                  <pic:spPr>
-                    <a:xfrm>
-                      <a:off x="0" y="0"/>
-                      <a:ext cx="5852160" cy="7783373"/>
-                    </a:xfrm>
-                    <a:prstGeom prst="rect"/>
-                  </pic:spPr>
-                </pic:pic>
-              </a:graphicData>
-            </a:graphic>
-          </wp:inline>
-        </w:drawing>
-      </w:r>
-      <w:r>
-        <w:br w:type="page"/>
-      </w:r>
-    </w:p>
-    <w:p>
-      <w:pPr>
-        <w:spacing w:after="200" w:before="0" w:line="276" w:lineRule="auto"/>
+        <w:spacing w:after="240" w:before="0" w:line="276" w:lineRule="auto"/>
         <w:jc w:val="center"/>
       </w:pPr>
       <w:r>
@@ -407,12 +321,12 @@
           <w:i w:val="0"/>
           <w:sz w:val="28"/>
         </w:rPr>
-        <w:t>Written Explanation of the Infographic</w:t>
-      </w:r>
-    </w:p>
-    <w:p>
-      <w:pPr>
-        <w:spacing w:after="80" w:before="0" w:line="276" w:lineRule="auto"/>
+        <w:t>Project Stakeholder Management</w:t>
+      </w:r>
+    </w:p>
+    <w:p>
+      <w:pPr>
+        <w:spacing w:after="120" w:before="0" w:line="276" w:lineRule="auto"/>
       </w:pPr>
       <w:r>
         <w:rPr>
@@ -426,7 +340,7 @@
     </w:p>
     <w:p>
       <w:pPr>
-        <w:spacing w:after="200" w:before="0" w:line="276" w:lineRule="auto"/>
+        <w:spacing w:after="160" w:before="0" w:line="276" w:lineRule="auto"/>
         <w:jc w:val="both"/>
       </w:pPr>
       <w:r>
@@ -436,12 +350,27 @@
           <w:i w:val="0"/>
           <w:sz w:val="24"/>
         </w:rPr>
-        <w:t>A project stakeholder is any individual, group, or organization that may affect, be affected by, or perceive itself to be affected by a decision, activity, or outcome of a project (Project Management Institute [PMI], 2021). Stakeholders can be internal, such as the sponsor, the project team, and senior managers, or external, such as customers, suppliers, investors, government bodies, and the local community (Freeman, 1984). Stakeholder management is the set of processes used to identify these people, analyze their expectations and their influence on the project, and develop strategies that engage them effectively in project decisions and execution (PMI, 2017).</w:t>
-      </w:r>
-    </w:p>
-    <w:p>
-      <w:pPr>
-        <w:spacing w:after="80" w:before="0" w:line="276" w:lineRule="auto"/>
+        <w:t>A project stakeholder is any individual, group, or organization that may affect, be affected by, or perceive itself to be affected by a decision, activity, or outcome of a project (Project Management Institute [PMI], 2021). Stakeholders can be internal, such as the sponsor, the project team, and senior managers. They can also be external, such as customers, suppliers, investors, government bodies, and the local community (Freeman, 1984).</w:t>
+      </w:r>
+    </w:p>
+    <w:p>
+      <w:pPr>
+        <w:spacing w:after="160" w:before="0" w:line="276" w:lineRule="auto"/>
+        <w:jc w:val="both"/>
+      </w:pPr>
+      <w:r>
+        <w:rPr>
+          <w:rFonts w:ascii="Times New Roman" w:hAnsi="Times New Roman" w:cs="Times New Roman" w:eastAsia="Times New Roman"/>
+          <w:b w:val="0"/>
+          <w:i w:val="0"/>
+          <w:sz w:val="24"/>
+        </w:rPr>
+        <w:t>Stakeholder management is the set of processes used to identify these people, analyze their expectations and their influence on the project, and develop strategies that engage them effectively in project decisions and execution (PMI, 2017).</w:t>
+      </w:r>
+    </w:p>
+    <w:p>
+      <w:pPr>
+        <w:spacing w:after="120" w:before="0" w:line="276" w:lineRule="auto"/>
       </w:pPr>
       <w:r>
         <w:rPr>
@@ -455,7 +384,7 @@
     </w:p>
     <w:p>
       <w:pPr>
-        <w:spacing w:after="200" w:before="0" w:line="276" w:lineRule="auto"/>
+        <w:spacing w:after="160" w:before="0" w:line="276" w:lineRule="auto"/>
         <w:jc w:val="both"/>
       </w:pPr>
       <w:r>
@@ -465,12 +394,269 @@
           <w:i w:val="0"/>
           <w:sz w:val="24"/>
         </w:rPr>
-        <w:t>The stakeholder management (engagement) plan is a part of the overall project management plan. It is built through four connected processes: identifying stakeholders, planning stakeholder engagement, managing stakeholder engagement, and monitoring stakeholder engagement (PMI, 2017). The plan normally contains a stakeholder register, an analysis of each stakeholder’s power, interest, and attitude, and a comparison between their current and desired engagement levels (unaware, resistant, neutral, supportive, or leading). It also states the communication requirements and the strategies needed to raise support. Because stakeholders and their positions change over time, the plan names who is responsible for it and when it is reviewed and updated.</w:t>
+        <w:t>The stakeholder management plan is part of the overall project management plan. It is built through four steps (PMI, 2017):</w:t>
       </w:r>
     </w:p>
     <w:p>
       <w:pPr>
         <w:spacing w:after="80" w:before="0" w:line="276" w:lineRule="auto"/>
+        <w:ind w:left="418" w:hanging="259"/>
+        <w:jc w:val="both"/>
+      </w:pPr>
+      <w:r>
+        <w:rPr>
+          <w:rFonts w:ascii="Times New Roman" w:hAnsi="Times New Roman" w:cs="Times New Roman" w:eastAsia="Times New Roman"/>
+          <w:sz w:val="24"/>
+        </w:rPr>
+        <w:t xml:space="preserve">• </w:t>
+      </w:r>
+      <w:r>
+        <w:rPr>
+          <w:rFonts w:ascii="Times New Roman" w:hAnsi="Times New Roman" w:cs="Times New Roman" w:eastAsia="Times New Roman"/>
+          <w:b/>
+          <w:sz w:val="24"/>
+        </w:rPr>
+        <w:t xml:space="preserve">Identify stakeholders: </w:t>
+      </w:r>
+      <w:r>
+        <w:rPr>
+          <w:rFonts w:ascii="Times New Roman" w:hAnsi="Times New Roman" w:cs="Times New Roman" w:eastAsia="Times New Roman"/>
+          <w:sz w:val="24"/>
+        </w:rPr>
+        <w:t>list everyone involved in a stakeholder register with their role, interest, and influence.</w:t>
+      </w:r>
+    </w:p>
+    <w:p>
+      <w:pPr>
+        <w:spacing w:after="80" w:before="0" w:line="276" w:lineRule="auto"/>
+        <w:ind w:left="418" w:hanging="259"/>
+        <w:jc w:val="both"/>
+      </w:pPr>
+      <w:r>
+        <w:rPr>
+          <w:rFonts w:ascii="Times New Roman" w:hAnsi="Times New Roman" w:cs="Times New Roman" w:eastAsia="Times New Roman"/>
+          <w:sz w:val="24"/>
+        </w:rPr>
+        <w:t xml:space="preserve">• </w:t>
+      </w:r>
+      <w:r>
+        <w:rPr>
+          <w:rFonts w:ascii="Times New Roman" w:hAnsi="Times New Roman" w:cs="Times New Roman" w:eastAsia="Times New Roman"/>
+          <w:b/>
+          <w:sz w:val="24"/>
+        </w:rPr>
+        <w:t xml:space="preserve">Plan stakeholder engagement: </w:t>
+      </w:r>
+      <w:r>
+        <w:rPr>
+          <w:rFonts w:ascii="Times New Roman" w:hAnsi="Times New Roman" w:cs="Times New Roman" w:eastAsia="Times New Roman"/>
+          <w:sz w:val="24"/>
+        </w:rPr>
+        <w:t>analyze each stakeholder’s power and interest, compare their current and desired engagement levels (unaware, resistant, neutral, supportive, leading), and choose strategies.</w:t>
+      </w:r>
+    </w:p>
+    <w:p>
+      <w:pPr>
+        <w:spacing w:after="80" w:before="0" w:line="276" w:lineRule="auto"/>
+        <w:ind w:left="418" w:hanging="259"/>
+        <w:jc w:val="both"/>
+      </w:pPr>
+      <w:r>
+        <w:rPr>
+          <w:rFonts w:ascii="Times New Roman" w:hAnsi="Times New Roman" w:cs="Times New Roman" w:eastAsia="Times New Roman"/>
+          <w:sz w:val="24"/>
+        </w:rPr>
+        <w:t xml:space="preserve">• </w:t>
+      </w:r>
+      <w:r>
+        <w:rPr>
+          <w:rFonts w:ascii="Times New Roman" w:hAnsi="Times New Roman" w:cs="Times New Roman" w:eastAsia="Times New Roman"/>
+          <w:b/>
+          <w:sz w:val="24"/>
+        </w:rPr>
+        <w:t xml:space="preserve">Manage stakeholder engagement: </w:t>
+      </w:r>
+      <w:r>
+        <w:rPr>
+          <w:rFonts w:ascii="Times New Roman" w:hAnsi="Times New Roman" w:cs="Times New Roman" w:eastAsia="Times New Roman"/>
+          <w:sz w:val="24"/>
+        </w:rPr>
+        <w:t>communicate, meet their needs, resolve issues, and build support.</w:t>
+      </w:r>
+    </w:p>
+    <w:p>
+      <w:pPr>
+        <w:spacing w:after="80" w:before="0" w:line="276" w:lineRule="auto"/>
+        <w:ind w:left="418" w:hanging="259"/>
+        <w:jc w:val="both"/>
+      </w:pPr>
+      <w:r>
+        <w:rPr>
+          <w:rFonts w:ascii="Times New Roman" w:hAnsi="Times New Roman" w:cs="Times New Roman" w:eastAsia="Times New Roman"/>
+          <w:sz w:val="24"/>
+        </w:rPr>
+        <w:t xml:space="preserve">• </w:t>
+      </w:r>
+      <w:r>
+        <w:rPr>
+          <w:rFonts w:ascii="Times New Roman" w:hAnsi="Times New Roman" w:cs="Times New Roman" w:eastAsia="Times New Roman"/>
+          <w:b/>
+          <w:sz w:val="24"/>
+        </w:rPr>
+        <w:t xml:space="preserve">Monitor stakeholder engagement: </w:t>
+      </w:r>
+      <w:r>
+        <w:rPr>
+          <w:rFonts w:ascii="Times New Roman" w:hAnsi="Times New Roman" w:cs="Times New Roman" w:eastAsia="Times New Roman"/>
+          <w:sz w:val="24"/>
+        </w:rPr>
+        <w:t>track relationships and update the plan as the project changes.</w:t>
+      </w:r>
+    </w:p>
+    <w:p>
+      <w:pPr>
+        <w:spacing w:after="160" w:before="0" w:line="276" w:lineRule="auto"/>
+        <w:jc w:val="both"/>
+      </w:pPr>
+      <w:r>
+        <w:rPr>
+          <w:rFonts w:ascii="Times New Roman" w:hAnsi="Times New Roman" w:cs="Times New Roman" w:eastAsia="Times New Roman"/>
+          <w:b w:val="0"/>
+          <w:i w:val="0"/>
+          <w:sz w:val="24"/>
+        </w:rPr>
+        <w:t>The plan usually contains:</w:t>
+      </w:r>
+    </w:p>
+    <w:p>
+      <w:pPr>
+        <w:spacing w:after="80" w:before="0" w:line="276" w:lineRule="auto"/>
+        <w:ind w:left="418" w:hanging="259"/>
+        <w:jc w:val="both"/>
+      </w:pPr>
+      <w:r>
+        <w:rPr>
+          <w:rFonts w:ascii="Times New Roman" w:hAnsi="Times New Roman" w:cs="Times New Roman" w:eastAsia="Times New Roman"/>
+          <w:sz w:val="24"/>
+        </w:rPr>
+        <w:t xml:space="preserve">• </w:t>
+      </w:r>
+      <w:r>
+        <w:rPr>
+          <w:rFonts w:ascii="Times New Roman" w:hAnsi="Times New Roman" w:cs="Times New Roman" w:eastAsia="Times New Roman"/>
+          <w:sz w:val="24"/>
+        </w:rPr>
+        <w:t>the stakeholder register</w:t>
+      </w:r>
+    </w:p>
+    <w:p>
+      <w:pPr>
+        <w:spacing w:after="80" w:before="0" w:line="276" w:lineRule="auto"/>
+        <w:ind w:left="418" w:hanging="259"/>
+        <w:jc w:val="both"/>
+      </w:pPr>
+      <w:r>
+        <w:rPr>
+          <w:rFonts w:ascii="Times New Roman" w:hAnsi="Times New Roman" w:cs="Times New Roman" w:eastAsia="Times New Roman"/>
+          <w:sz w:val="24"/>
+        </w:rPr>
+        <w:t xml:space="preserve">• </w:t>
+      </w:r>
+      <w:r>
+        <w:rPr>
+          <w:rFonts w:ascii="Times New Roman" w:hAnsi="Times New Roman" w:cs="Times New Roman" w:eastAsia="Times New Roman"/>
+          <w:sz w:val="24"/>
+        </w:rPr>
+        <w:t>the power and interest analysis</w:t>
+      </w:r>
+    </w:p>
+    <w:p>
+      <w:pPr>
+        <w:spacing w:after="80" w:before="0" w:line="276" w:lineRule="auto"/>
+        <w:ind w:left="418" w:hanging="259"/>
+        <w:jc w:val="both"/>
+      </w:pPr>
+      <w:r>
+        <w:rPr>
+          <w:rFonts w:ascii="Times New Roman" w:hAnsi="Times New Roman" w:cs="Times New Roman" w:eastAsia="Times New Roman"/>
+          <w:sz w:val="24"/>
+        </w:rPr>
+        <w:t xml:space="preserve">• </w:t>
+      </w:r>
+      <w:r>
+        <w:rPr>
+          <w:rFonts w:ascii="Times New Roman" w:hAnsi="Times New Roman" w:cs="Times New Roman" w:eastAsia="Times New Roman"/>
+          <w:sz w:val="24"/>
+        </w:rPr>
+        <w:t>the engagement levels</w:t>
+      </w:r>
+    </w:p>
+    <w:p>
+      <w:pPr>
+        <w:spacing w:after="80" w:before="0" w:line="276" w:lineRule="auto"/>
+        <w:ind w:left="418" w:hanging="259"/>
+        <w:jc w:val="both"/>
+      </w:pPr>
+      <w:r>
+        <w:rPr>
+          <w:rFonts w:ascii="Times New Roman" w:hAnsi="Times New Roman" w:cs="Times New Roman" w:eastAsia="Times New Roman"/>
+          <w:sz w:val="24"/>
+        </w:rPr>
+        <w:t xml:space="preserve">• </w:t>
+      </w:r>
+      <w:r>
+        <w:rPr>
+          <w:rFonts w:ascii="Times New Roman" w:hAnsi="Times New Roman" w:cs="Times New Roman" w:eastAsia="Times New Roman"/>
+          <w:sz w:val="24"/>
+        </w:rPr>
+        <w:t>the communication requirements (what, how, how often, and by whom)</w:t>
+      </w:r>
+    </w:p>
+    <w:p>
+      <w:pPr>
+        <w:spacing w:after="80" w:before="0" w:line="276" w:lineRule="auto"/>
+        <w:ind w:left="418" w:hanging="259"/>
+        <w:jc w:val="both"/>
+      </w:pPr>
+      <w:r>
+        <w:rPr>
+          <w:rFonts w:ascii="Times New Roman" w:hAnsi="Times New Roman" w:cs="Times New Roman" w:eastAsia="Times New Roman"/>
+          <w:sz w:val="24"/>
+        </w:rPr>
+        <w:t xml:space="preserve">• </w:t>
+      </w:r>
+      <w:r>
+        <w:rPr>
+          <w:rFonts w:ascii="Times New Roman" w:hAnsi="Times New Roman" w:cs="Times New Roman" w:eastAsia="Times New Roman"/>
+          <w:sz w:val="24"/>
+        </w:rPr>
+        <w:t>the engagement strategies</w:t>
+      </w:r>
+    </w:p>
+    <w:p>
+      <w:pPr>
+        <w:spacing w:after="80" w:before="0" w:line="276" w:lineRule="auto"/>
+        <w:ind w:left="418" w:hanging="259"/>
+        <w:jc w:val="both"/>
+      </w:pPr>
+      <w:r>
+        <w:rPr>
+          <w:rFonts w:ascii="Times New Roman" w:hAnsi="Times New Roman" w:cs="Times New Roman" w:eastAsia="Times New Roman"/>
+          <w:sz w:val="24"/>
+        </w:rPr>
+        <w:t xml:space="preserve">• </w:t>
+      </w:r>
+      <w:r>
+        <w:rPr>
+          <w:rFonts w:ascii="Times New Roman" w:hAnsi="Times New Roman" w:cs="Times New Roman" w:eastAsia="Times New Roman"/>
+          <w:sz w:val="24"/>
+        </w:rPr>
+        <w:t>who updates the plan and when it is reviewed</w:t>
+      </w:r>
+    </w:p>
+    <w:p>
+      <w:pPr>
+        <w:spacing w:after="120" w:before="0" w:line="276" w:lineRule="auto"/>
       </w:pPr>
       <w:r>
         <w:rPr>
@@ -479,12 +665,200 @@
           <w:i w:val="0"/>
           <w:sz w:val="24"/>
         </w:rPr>
-        <w:t>3. Why Stakeholder Management Is Important</w:t>
-      </w:r>
-    </w:p>
-    <w:p>
-      <w:pPr>
-        <w:spacing w:after="200" w:before="0" w:line="276" w:lineRule="auto"/>
+        <w:t>3. Why Is Stakeholder Management Important?</w:t>
+      </w:r>
+    </w:p>
+    <w:p>
+      <w:pPr>
+        <w:spacing w:after="80" w:before="0" w:line="276" w:lineRule="auto"/>
+        <w:ind w:left="418" w:hanging="259"/>
+        <w:jc w:val="both"/>
+      </w:pPr>
+      <w:r>
+        <w:rPr>
+          <w:rFonts w:ascii="Times New Roman" w:hAnsi="Times New Roman" w:cs="Times New Roman" w:eastAsia="Times New Roman"/>
+          <w:sz w:val="24"/>
+        </w:rPr>
+        <w:t xml:space="preserve">• </w:t>
+      </w:r>
+      <w:r>
+        <w:rPr>
+          <w:rFonts w:ascii="Times New Roman" w:hAnsi="Times New Roman" w:cs="Times New Roman" w:eastAsia="Times New Roman"/>
+          <w:b/>
+          <w:sz w:val="24"/>
+        </w:rPr>
+        <w:t xml:space="preserve">Wins support: </w:t>
+      </w:r>
+      <w:r>
+        <w:rPr>
+          <w:rFonts w:ascii="Times New Roman" w:hAnsi="Times New Roman" w:cs="Times New Roman" w:eastAsia="Times New Roman"/>
+          <w:sz w:val="24"/>
+        </w:rPr>
+        <w:t>secures commitment, approvals, and resources from key people.</w:t>
+      </w:r>
+    </w:p>
+    <w:p>
+      <w:pPr>
+        <w:spacing w:after="80" w:before="0" w:line="276" w:lineRule="auto"/>
+        <w:ind w:left="418" w:hanging="259"/>
+        <w:jc w:val="both"/>
+      </w:pPr>
+      <w:r>
+        <w:rPr>
+          <w:rFonts w:ascii="Times New Roman" w:hAnsi="Times New Roman" w:cs="Times New Roman" w:eastAsia="Times New Roman"/>
+          <w:sz w:val="24"/>
+        </w:rPr>
+        <w:t xml:space="preserve">• </w:t>
+      </w:r>
+      <w:r>
+        <w:rPr>
+          <w:rFonts w:ascii="Times New Roman" w:hAnsi="Times New Roman" w:cs="Times New Roman" w:eastAsia="Times New Roman"/>
+          <w:b/>
+          <w:sz w:val="24"/>
+        </w:rPr>
+        <w:t xml:space="preserve">Reduces risk: </w:t>
+      </w:r>
+      <w:r>
+        <w:rPr>
+          <w:rFonts w:ascii="Times New Roman" w:hAnsi="Times New Roman" w:cs="Times New Roman" w:eastAsia="Times New Roman"/>
+          <w:sz w:val="24"/>
+        </w:rPr>
+        <w:t>spots resistance and conflict early, before they delay the project.</w:t>
+      </w:r>
+    </w:p>
+    <w:p>
+      <w:pPr>
+        <w:spacing w:after="80" w:before="0" w:line="276" w:lineRule="auto"/>
+        <w:ind w:left="418" w:hanging="259"/>
+        <w:jc w:val="both"/>
+      </w:pPr>
+      <w:r>
+        <w:rPr>
+          <w:rFonts w:ascii="Times New Roman" w:hAnsi="Times New Roman" w:cs="Times New Roman" w:eastAsia="Times New Roman"/>
+          <w:sz w:val="24"/>
+        </w:rPr>
+        <w:t xml:space="preserve">• </w:t>
+      </w:r>
+      <w:r>
+        <w:rPr>
+          <w:rFonts w:ascii="Times New Roman" w:hAnsi="Times New Roman" w:cs="Times New Roman" w:eastAsia="Times New Roman"/>
+          <w:b/>
+          <w:sz w:val="24"/>
+        </w:rPr>
+        <w:t xml:space="preserve">Aligns expectations: </w:t>
+      </w:r>
+      <w:r>
+        <w:rPr>
+          <w:rFonts w:ascii="Times New Roman" w:hAnsi="Times New Roman" w:cs="Times New Roman" w:eastAsia="Times New Roman"/>
+          <w:sz w:val="24"/>
+        </w:rPr>
+        <w:t>agrees on scope, quality, and success criteria, which limits scope creep (Larson &amp; Gray, 2021).</w:t>
+      </w:r>
+    </w:p>
+    <w:p>
+      <w:pPr>
+        <w:spacing w:after="80" w:before="0" w:line="276" w:lineRule="auto"/>
+        <w:ind w:left="418" w:hanging="259"/>
+        <w:jc w:val="both"/>
+      </w:pPr>
+      <w:r>
+        <w:rPr>
+          <w:rFonts w:ascii="Times New Roman" w:hAnsi="Times New Roman" w:cs="Times New Roman" w:eastAsia="Times New Roman"/>
+          <w:sz w:val="24"/>
+        </w:rPr>
+        <w:t xml:space="preserve">• </w:t>
+      </w:r>
+      <w:r>
+        <w:rPr>
+          <w:rFonts w:ascii="Times New Roman" w:hAnsi="Times New Roman" w:cs="Times New Roman" w:eastAsia="Times New Roman"/>
+          <w:b/>
+          <w:sz w:val="24"/>
+        </w:rPr>
+        <w:t xml:space="preserve">Improves decisions: </w:t>
+      </w:r>
+      <w:r>
+        <w:rPr>
+          <w:rFonts w:ascii="Times New Roman" w:hAnsi="Times New Roman" w:cs="Times New Roman" w:eastAsia="Times New Roman"/>
+          <w:sz w:val="24"/>
+        </w:rPr>
+        <w:t>uses stakeholders’ knowledge and feedback.</w:t>
+      </w:r>
+    </w:p>
+    <w:p>
+      <w:pPr>
+        <w:spacing w:after="80" w:before="0" w:line="276" w:lineRule="auto"/>
+        <w:ind w:left="418" w:hanging="259"/>
+        <w:jc w:val="both"/>
+      </w:pPr>
+      <w:r>
+        <w:rPr>
+          <w:rFonts w:ascii="Times New Roman" w:hAnsi="Times New Roman" w:cs="Times New Roman" w:eastAsia="Times New Roman"/>
+          <w:sz w:val="24"/>
+        </w:rPr>
+        <w:t xml:space="preserve">• </w:t>
+      </w:r>
+      <w:r>
+        <w:rPr>
+          <w:rFonts w:ascii="Times New Roman" w:hAnsi="Times New Roman" w:cs="Times New Roman" w:eastAsia="Times New Roman"/>
+          <w:b/>
+          <w:sz w:val="24"/>
+        </w:rPr>
+        <w:t xml:space="preserve">Builds trust: </w:t>
+      </w:r>
+      <w:r>
+        <w:rPr>
+          <w:rFonts w:ascii="Times New Roman" w:hAnsi="Times New Roman" w:cs="Times New Roman" w:eastAsia="Times New Roman"/>
+          <w:sz w:val="24"/>
+        </w:rPr>
+        <w:t>clear and regular communication protects the organization’s reputation.</w:t>
+      </w:r>
+    </w:p>
+    <w:p>
+      <w:pPr>
+        <w:spacing w:after="80" w:before="0" w:line="276" w:lineRule="auto"/>
+        <w:ind w:left="418" w:hanging="259"/>
+        <w:jc w:val="both"/>
+      </w:pPr>
+      <w:r>
+        <w:rPr>
+          <w:rFonts w:ascii="Times New Roman" w:hAnsi="Times New Roman" w:cs="Times New Roman" w:eastAsia="Times New Roman"/>
+          <w:sz w:val="24"/>
+        </w:rPr>
+        <w:t xml:space="preserve">• </w:t>
+      </w:r>
+      <w:r>
+        <w:rPr>
+          <w:rFonts w:ascii="Times New Roman" w:hAnsi="Times New Roman" w:cs="Times New Roman" w:eastAsia="Times New Roman"/>
+          <w:b/>
+          <w:sz w:val="24"/>
+        </w:rPr>
+        <w:t xml:space="preserve">Increases project success: </w:t>
+      </w:r>
+      <w:r>
+        <w:rPr>
+          <w:rFonts w:ascii="Times New Roman" w:hAnsi="Times New Roman" w:cs="Times New Roman" w:eastAsia="Times New Roman"/>
+          <w:sz w:val="24"/>
+        </w:rPr>
+        <w:t>satisfied stakeholders are more likely to accept the final deliverables (Bourne, 2009).</w:t>
+      </w:r>
+    </w:p>
+    <w:p>
+      <w:pPr>
+        <w:spacing w:after="120" w:before="0" w:line="276" w:lineRule="auto"/>
+      </w:pPr>
+      <w:r>
+        <w:rPr>
+          <w:rFonts w:ascii="Times New Roman" w:hAnsi="Times New Roman" w:cs="Times New Roman" w:eastAsia="Times New Roman"/>
+          <w:b/>
+          <w:i w:val="0"/>
+          <w:sz w:val="24"/>
+        </w:rPr>
+        <w:t>4. Stakeholder Management Strategies</w:t>
+      </w:r>
+    </w:p>
+    <w:p>
+      <w:pPr>
+        <w:spacing w:after="160" w:before="0" w:line="276" w:lineRule="auto"/>
         <w:jc w:val="both"/>
       </w:pPr>
       <w:r>
@@ -494,12 +868,143 @@
           <w:i w:val="0"/>
           <w:sz w:val="24"/>
         </w:rPr>
-        <w:t>Effective stakeholder management increases the chance of project success. It secures the support, approvals, and resources that a project needs. It reduces risk by showing resistance and conflict early, and it aligns expectations about scope, quality, and success criteria, which limits scope creep (Larson &amp; Gray, 2021). Involving stakeholders also improves decisions because their knowledge and feedback are used. Clear and regular communication builds trust and protects the organization’s reputation. Finally, stakeholders who are satisfied during the project are more likely to accept its final deliverables (Bourne, 2009).</w:t>
+        <w:t>A common tool is the Power/Interest Grid (Mendelow, 1991):</w:t>
       </w:r>
     </w:p>
     <w:p>
       <w:pPr>
         <w:spacing w:after="80" w:before="0" w:line="276" w:lineRule="auto"/>
+        <w:ind w:left="418" w:hanging="259"/>
+        <w:jc w:val="both"/>
+      </w:pPr>
+      <w:r>
+        <w:rPr>
+          <w:rFonts w:ascii="Times New Roman" w:hAnsi="Times New Roman" w:cs="Times New Roman" w:eastAsia="Times New Roman"/>
+          <w:sz w:val="24"/>
+        </w:rPr>
+        <w:t xml:space="preserve">• </w:t>
+      </w:r>
+      <w:r>
+        <w:rPr>
+          <w:rFonts w:ascii="Times New Roman" w:hAnsi="Times New Roman" w:cs="Times New Roman" w:eastAsia="Times New Roman"/>
+          <w:b/>
+          <w:sz w:val="24"/>
+        </w:rPr>
+        <w:t xml:space="preserve">Manage closely (high power, high interest): </w:t>
+      </w:r>
+      <w:r>
+        <w:rPr>
+          <w:rFonts w:ascii="Times New Roman" w:hAnsi="Times New Roman" w:cs="Times New Roman" w:eastAsia="Times New Roman"/>
+          <w:sz w:val="24"/>
+        </w:rPr>
+        <w:t>involve them fully and make decisions together. Examples: sponsor, owners, key clients.</w:t>
+      </w:r>
+    </w:p>
+    <w:p>
+      <w:pPr>
+        <w:spacing w:after="80" w:before="0" w:line="276" w:lineRule="auto"/>
+        <w:ind w:left="418" w:hanging="259"/>
+        <w:jc w:val="both"/>
+      </w:pPr>
+      <w:r>
+        <w:rPr>
+          <w:rFonts w:ascii="Times New Roman" w:hAnsi="Times New Roman" w:cs="Times New Roman" w:eastAsia="Times New Roman"/>
+          <w:sz w:val="24"/>
+        </w:rPr>
+        <w:t xml:space="preserve">• </w:t>
+      </w:r>
+      <w:r>
+        <w:rPr>
+          <w:rFonts w:ascii="Times New Roman" w:hAnsi="Times New Roman" w:cs="Times New Roman" w:eastAsia="Times New Roman"/>
+          <w:b/>
+          <w:sz w:val="24"/>
+        </w:rPr>
+        <w:t xml:space="preserve">Keep satisfied (high power, low interest): </w:t>
+      </w:r>
+      <w:r>
+        <w:rPr>
+          <w:rFonts w:ascii="Times New Roman" w:hAnsi="Times New Roman" w:cs="Times New Roman" w:eastAsia="Times New Roman"/>
+          <w:sz w:val="24"/>
+        </w:rPr>
+        <w:t>meet their needs and consult them on key decisions without overloading them. Examples: regulators, senior executives.</w:t>
+      </w:r>
+    </w:p>
+    <w:p>
+      <w:pPr>
+        <w:spacing w:after="80" w:before="0" w:line="276" w:lineRule="auto"/>
+        <w:ind w:left="418" w:hanging="259"/>
+        <w:jc w:val="both"/>
+      </w:pPr>
+      <w:r>
+        <w:rPr>
+          <w:rFonts w:ascii="Times New Roman" w:hAnsi="Times New Roman" w:cs="Times New Roman" w:eastAsia="Times New Roman"/>
+          <w:sz w:val="24"/>
+        </w:rPr>
+        <w:t xml:space="preserve">• </w:t>
+      </w:r>
+      <w:r>
+        <w:rPr>
+          <w:rFonts w:ascii="Times New Roman" w:hAnsi="Times New Roman" w:cs="Times New Roman" w:eastAsia="Times New Roman"/>
+          <w:b/>
+          <w:sz w:val="24"/>
+        </w:rPr>
+        <w:t xml:space="preserve">Keep informed (low power, high interest): </w:t>
+      </w:r>
+      <w:r>
+        <w:rPr>
+          <w:rFonts w:ascii="Times New Roman" w:hAnsi="Times New Roman" w:cs="Times New Roman" w:eastAsia="Times New Roman"/>
+          <w:sz w:val="24"/>
+        </w:rPr>
+        <w:t>send regular updates and listen to their concerns. Examples: staff, end users, community.</w:t>
+      </w:r>
+    </w:p>
+    <w:p>
+      <w:pPr>
+        <w:spacing w:after="80" w:before="0" w:line="276" w:lineRule="auto"/>
+        <w:ind w:left="418" w:hanging="259"/>
+        <w:jc w:val="both"/>
+      </w:pPr>
+      <w:r>
+        <w:rPr>
+          <w:rFonts w:ascii="Times New Roman" w:hAnsi="Times New Roman" w:cs="Times New Roman" w:eastAsia="Times New Roman"/>
+          <w:sz w:val="24"/>
+        </w:rPr>
+        <w:t xml:space="preserve">• </w:t>
+      </w:r>
+      <w:r>
+        <w:rPr>
+          <w:rFonts w:ascii="Times New Roman" w:hAnsi="Times New Roman" w:cs="Times New Roman" w:eastAsia="Times New Roman"/>
+          <w:b/>
+          <w:sz w:val="24"/>
+        </w:rPr>
+        <w:t xml:space="preserve">Monitor (low power, low interest): </w:t>
+      </w:r>
+      <w:r>
+        <w:rPr>
+          <w:rFonts w:ascii="Times New Roman" w:hAnsi="Times New Roman" w:cs="Times New Roman" w:eastAsia="Times New Roman"/>
+          <w:sz w:val="24"/>
+        </w:rPr>
+        <w:t>watch for changes and keep communication light. Example: the general public.</w:t>
+      </w:r>
+    </w:p>
+    <w:p>
+      <w:pPr>
+        <w:spacing w:after="160" w:before="0" w:line="276" w:lineRule="auto"/>
+        <w:jc w:val="both"/>
+      </w:pPr>
+      <w:r>
+        <w:rPr>
+          <w:rFonts w:ascii="Times New Roman" w:hAnsi="Times New Roman" w:cs="Times New Roman" w:eastAsia="Times New Roman"/>
+          <w:b w:val="0"/>
+          <w:i w:val="0"/>
+          <w:sz w:val="24"/>
+        </w:rPr>
+        <w:t>Engagement can also be seen as a spectrum: Inform → Consult → Involve → Collaborate → Empower. The project manager increases a stakeholder’s involvement as their power and interest grow (PMI, 2021; Kerzner, 2022).</w:t>
+      </w:r>
+    </w:p>
+    <w:p>
+      <w:pPr>
+        <w:spacing w:after="120" w:before="0" w:line="276" w:lineRule="auto"/>
       </w:pPr>
       <w:r>
         <w:rPr>
@@ -508,12 +1013,12 @@
           <w:i w:val="0"/>
           <w:sz w:val="24"/>
         </w:rPr>
-        <w:t>4. Stakeholder Management Strategies</w:t>
-      </w:r>
-    </w:p>
-    <w:p>
-      <w:pPr>
-        <w:spacing w:after="200" w:before="0" w:line="276" w:lineRule="auto"/>
+        <w:t>5. Stakeholder Management in the Hospitality Business</w:t>
+      </w:r>
+    </w:p>
+    <w:p>
+      <w:pPr>
+        <w:spacing w:after="160" w:before="0" w:line="276" w:lineRule="auto"/>
         <w:jc w:val="both"/>
       </w:pPr>
       <w:r>
@@ -523,26 +1028,312 @@
           <w:i w:val="0"/>
           <w:sz w:val="24"/>
         </w:rPr>
-        <w:t>A common tool for choosing strategies is the power/interest grid (Mendelow, 1991). Stakeholders with high power and high interest are managed closely through full involvement and joint decisions. Those with high power but low interest are kept satisfied, and those with low power but high interest are kept informed through regular updates. Stakeholders with low power and low interest are monitored with little effort. The level of engagement can also be described as a spectrum from inform, to consult, involve, collaborate, and empower. The project manager moves each stakeholder toward the level of engagement that the project needs (PMI, 2021; Kerzner, 2022).</w:t>
+        <w:t>Hospitality projects include opening a new hotel, renovating rooms, introducing a new booking system, or organizing a large event. Each group of stakeholders gets a different strategy:</w:t>
       </w:r>
     </w:p>
     <w:p>
       <w:pPr>
         <w:spacing w:after="80" w:before="0" w:line="276" w:lineRule="auto"/>
-      </w:pPr>
+        <w:ind w:left="418" w:hanging="259"/>
+        <w:jc w:val="both"/>
+      </w:pPr>
+      <w:r>
+        <w:rPr>
+          <w:rFonts w:ascii="Times New Roman" w:hAnsi="Times New Roman" w:cs="Times New Roman" w:eastAsia="Times New Roman"/>
+          <w:sz w:val="24"/>
+        </w:rPr>
+        <w:t xml:space="preserve">• </w:t>
+      </w:r>
       <w:r>
         <w:rPr>
           <w:rFonts w:ascii="Times New Roman" w:hAnsi="Times New Roman" w:cs="Times New Roman" w:eastAsia="Times New Roman"/>
           <w:b/>
-          <w:i w:val="0"/>
-          <w:sz w:val="24"/>
-        </w:rPr>
-        <w:t>5. Stakeholder Management in the Hospitality Business</w:t>
-      </w:r>
-    </w:p>
-    <w:p>
-      <w:pPr>
-        <w:spacing w:after="200" w:before="0" w:line="276" w:lineRule="auto"/>
+          <w:sz w:val="24"/>
+        </w:rPr>
+        <w:t xml:space="preserve">Owners and investors (manage closely): </w:t>
+      </w:r>
+      <w:r>
+        <w:rPr>
+          <w:rFonts w:ascii="Times New Roman" w:hAnsi="Times New Roman" w:cs="Times New Roman" w:eastAsia="Times New Roman"/>
+          <w:sz w:val="24"/>
+        </w:rPr>
+        <w:t>they approve budgets and expect a return, so they receive regular progress and cost reports.</w:t>
+      </w:r>
+    </w:p>
+    <w:p>
+      <w:pPr>
+        <w:spacing w:after="80" w:before="0" w:line="276" w:lineRule="auto"/>
+        <w:ind w:left="418" w:hanging="259"/>
+        <w:jc w:val="both"/>
+      </w:pPr>
+      <w:r>
+        <w:rPr>
+          <w:rFonts w:ascii="Times New Roman" w:hAnsi="Times New Roman" w:cs="Times New Roman" w:eastAsia="Times New Roman"/>
+          <w:sz w:val="24"/>
+        </w:rPr>
+        <w:t xml:space="preserve">• </w:t>
+      </w:r>
+      <w:r>
+        <w:rPr>
+          <w:rFonts w:ascii="Times New Roman" w:hAnsi="Times New Roman" w:cs="Times New Roman" w:eastAsia="Times New Roman"/>
+          <w:b/>
+          <w:sz w:val="24"/>
+        </w:rPr>
+        <w:t xml:space="preserve">Government and regulators (keep satisfied): </w:t>
+      </w:r>
+      <w:r>
+        <w:rPr>
+          <w:rFonts w:ascii="Times New Roman" w:hAnsi="Times New Roman" w:cs="Times New Roman" w:eastAsia="Times New Roman"/>
+          <w:sz w:val="24"/>
+        </w:rPr>
+        <w:t>the Ministry of Tourism, the municipality, and civil defense must approve licenses and safety standards.</w:t>
+      </w:r>
+    </w:p>
+    <w:p>
+      <w:pPr>
+        <w:spacing w:after="80" w:before="0" w:line="276" w:lineRule="auto"/>
+        <w:ind w:left="418" w:hanging="259"/>
+        <w:jc w:val="both"/>
+      </w:pPr>
+      <w:r>
+        <w:rPr>
+          <w:rFonts w:ascii="Times New Roman" w:hAnsi="Times New Roman" w:cs="Times New Roman" w:eastAsia="Times New Roman"/>
+          <w:sz w:val="24"/>
+        </w:rPr>
+        <w:t xml:space="preserve">• </w:t>
+      </w:r>
+      <w:r>
+        <w:rPr>
+          <w:rFonts w:ascii="Times New Roman" w:hAnsi="Times New Roman" w:cs="Times New Roman" w:eastAsia="Times New Roman"/>
+          <w:b/>
+          <w:sz w:val="24"/>
+        </w:rPr>
+        <w:t xml:space="preserve">Employees (involve): </w:t>
+      </w:r>
+      <w:r>
+        <w:rPr>
+          <w:rFonts w:ascii="Times New Roman" w:hAnsi="Times New Roman" w:cs="Times New Roman" w:eastAsia="Times New Roman"/>
+          <w:sz w:val="24"/>
+        </w:rPr>
+        <w:t>staff are trained on new systems and services because they deliver the guest experience.</w:t>
+      </w:r>
+    </w:p>
+    <w:p>
+      <w:pPr>
+        <w:spacing w:after="80" w:before="0" w:line="276" w:lineRule="auto"/>
+        <w:ind w:left="418" w:hanging="259"/>
+        <w:jc w:val="both"/>
+      </w:pPr>
+      <w:r>
+        <w:rPr>
+          <w:rFonts w:ascii="Times New Roman" w:hAnsi="Times New Roman" w:cs="Times New Roman" w:eastAsia="Times New Roman"/>
+          <w:sz w:val="24"/>
+        </w:rPr>
+        <w:t xml:space="preserve">• </w:t>
+      </w:r>
+      <w:r>
+        <w:rPr>
+          <w:rFonts w:ascii="Times New Roman" w:hAnsi="Times New Roman" w:cs="Times New Roman" w:eastAsia="Times New Roman"/>
+          <w:b/>
+          <w:sz w:val="24"/>
+        </w:rPr>
+        <w:t xml:space="preserve">Suppliers and contractors (collaborate): </w:t>
+      </w:r>
+      <w:r>
+        <w:rPr>
+          <w:rFonts w:ascii="Times New Roman" w:hAnsi="Times New Roman" w:cs="Times New Roman" w:eastAsia="Times New Roman"/>
+          <w:sz w:val="24"/>
+        </w:rPr>
+        <w:t>the hotel agrees contracts, delivery dates, and quality standards with them.</w:t>
+      </w:r>
+    </w:p>
+    <w:p>
+      <w:pPr>
+        <w:spacing w:after="80" w:before="0" w:line="276" w:lineRule="auto"/>
+        <w:ind w:left="418" w:hanging="259"/>
+        <w:jc w:val="both"/>
+      </w:pPr>
+      <w:r>
+        <w:rPr>
+          <w:rFonts w:ascii="Times New Roman" w:hAnsi="Times New Roman" w:cs="Times New Roman" w:eastAsia="Times New Roman"/>
+          <w:sz w:val="24"/>
+        </w:rPr>
+        <w:t xml:space="preserve">• </w:t>
+      </w:r>
+      <w:r>
+        <w:rPr>
+          <w:rFonts w:ascii="Times New Roman" w:hAnsi="Times New Roman" w:cs="Times New Roman" w:eastAsia="Times New Roman"/>
+          <w:b/>
+          <w:sz w:val="24"/>
+        </w:rPr>
+        <w:t xml:space="preserve">Guests (keep informed): </w:t>
+      </w:r>
+      <w:r>
+        <w:rPr>
+          <w:rFonts w:ascii="Times New Roman" w:hAnsi="Times New Roman" w:cs="Times New Roman" w:eastAsia="Times New Roman"/>
+          <w:sz w:val="24"/>
+        </w:rPr>
+        <w:t>guests are told about noise or closed facilities, offered alternatives, and asked for feedback.</w:t>
+      </w:r>
+    </w:p>
+    <w:p>
+      <w:pPr>
+        <w:spacing w:after="80" w:before="0" w:line="276" w:lineRule="auto"/>
+        <w:ind w:left="418" w:hanging="259"/>
+        <w:jc w:val="both"/>
+      </w:pPr>
+      <w:r>
+        <w:rPr>
+          <w:rFonts w:ascii="Times New Roman" w:hAnsi="Times New Roman" w:cs="Times New Roman" w:eastAsia="Times New Roman"/>
+          <w:sz w:val="24"/>
+        </w:rPr>
+        <w:t xml:space="preserve">• </w:t>
+      </w:r>
+      <w:r>
+        <w:rPr>
+          <w:rFonts w:ascii="Times New Roman" w:hAnsi="Times New Roman" w:cs="Times New Roman" w:eastAsia="Times New Roman"/>
+          <w:b/>
+          <w:sz w:val="24"/>
+        </w:rPr>
+        <w:t xml:space="preserve">Community, online travel agencies, and tour operators (keep informed): </w:t>
+      </w:r>
+      <w:r>
+        <w:rPr>
+          <w:rFonts w:ascii="Times New Roman" w:hAnsi="Times New Roman" w:cs="Times New Roman" w:eastAsia="Times New Roman"/>
+          <w:sz w:val="24"/>
+        </w:rPr>
+        <w:t>keeping them informed protects the hotel’s reputation and its booking channels.</w:t>
+      </w:r>
+    </w:p>
+    <w:p>
+      <w:pPr>
+        <w:spacing w:after="80" w:before="0" w:line="276" w:lineRule="auto"/>
+        <w:jc w:val="both"/>
+      </w:pPr>
+      <w:r>
+        <w:rPr>
+          <w:rFonts w:ascii="Times New Roman" w:hAnsi="Times New Roman" w:cs="Times New Roman" w:eastAsia="Times New Roman"/>
+          <w:b/>
+          <w:sz w:val="24"/>
+        </w:rPr>
+        <w:t xml:space="preserve">Example: </w:t>
+      </w:r>
+      <w:r>
+        <w:rPr>
+          <w:rFonts w:ascii="Times New Roman" w:hAnsi="Times New Roman" w:cs="Times New Roman" w:eastAsia="Times New Roman"/>
+          <w:sz w:val="24"/>
+        </w:rPr>
+        <w:t>A hotel near the Prophet’s Mosque in Al-Madinah plans a renovation. The project manager:</w:t>
+      </w:r>
+    </w:p>
+    <w:p>
+      <w:pPr>
+        <w:spacing w:after="80" w:before="0" w:line="276" w:lineRule="auto"/>
+        <w:ind w:left="418" w:hanging="259"/>
+        <w:jc w:val="both"/>
+      </w:pPr>
+      <w:r>
+        <w:rPr>
+          <w:rFonts w:ascii="Times New Roman" w:hAnsi="Times New Roman" w:cs="Times New Roman" w:eastAsia="Times New Roman"/>
+          <w:sz w:val="24"/>
+        </w:rPr>
+        <w:t xml:space="preserve">• </w:t>
+      </w:r>
+      <w:r>
+        <w:rPr>
+          <w:rFonts w:ascii="Times New Roman" w:hAnsi="Times New Roman" w:cs="Times New Roman" w:eastAsia="Times New Roman"/>
+          <w:sz w:val="24"/>
+        </w:rPr>
+        <w:t>holds monthly meetings with the owners</w:t>
+      </w:r>
+    </w:p>
+    <w:p>
+      <w:pPr>
+        <w:spacing w:after="80" w:before="0" w:line="276" w:lineRule="auto"/>
+        <w:ind w:left="418" w:hanging="259"/>
+        <w:jc w:val="both"/>
+      </w:pPr>
+      <w:r>
+        <w:rPr>
+          <w:rFonts w:ascii="Times New Roman" w:hAnsi="Times New Roman" w:cs="Times New Roman" w:eastAsia="Times New Roman"/>
+          <w:sz w:val="24"/>
+        </w:rPr>
+        <w:t xml:space="preserve">• </w:t>
+      </w:r>
+      <w:r>
+        <w:rPr>
+          <w:rFonts w:ascii="Times New Roman" w:hAnsi="Times New Roman" w:cs="Times New Roman" w:eastAsia="Times New Roman"/>
+          <w:sz w:val="24"/>
+        </w:rPr>
+        <w:t>gets Ministry of Tourism approvals early</w:t>
+      </w:r>
+    </w:p>
+    <w:p>
+      <w:pPr>
+        <w:spacing w:after="80" w:before="0" w:line="276" w:lineRule="auto"/>
+        <w:ind w:left="418" w:hanging="259"/>
+        <w:jc w:val="both"/>
+      </w:pPr>
+      <w:r>
+        <w:rPr>
+          <w:rFonts w:ascii="Times New Roman" w:hAnsi="Times New Roman" w:cs="Times New Roman" w:eastAsia="Times New Roman"/>
+          <w:sz w:val="24"/>
+        </w:rPr>
+        <w:t xml:space="preserve">• </w:t>
+      </w:r>
+      <w:r>
+        <w:rPr>
+          <w:rFonts w:ascii="Times New Roman" w:hAnsi="Times New Roman" w:cs="Times New Roman" w:eastAsia="Times New Roman"/>
+          <w:sz w:val="24"/>
+        </w:rPr>
+        <w:t>schedules the work outside the peak Umrah and Ramadan seasons</w:t>
+      </w:r>
+    </w:p>
+    <w:p>
+      <w:pPr>
+        <w:spacing w:after="80" w:before="0" w:line="276" w:lineRule="auto"/>
+        <w:ind w:left="418" w:hanging="259"/>
+        <w:jc w:val="both"/>
+      </w:pPr>
+      <w:r>
+        <w:rPr>
+          <w:rFonts w:ascii="Times New Roman" w:hAnsi="Times New Roman" w:cs="Times New Roman" w:eastAsia="Times New Roman"/>
+          <w:sz w:val="24"/>
+        </w:rPr>
+        <w:t xml:space="preserve">• </w:t>
+      </w:r>
+      <w:r>
+        <w:rPr>
+          <w:rFonts w:ascii="Times New Roman" w:hAnsi="Times New Roman" w:cs="Times New Roman" w:eastAsia="Times New Roman"/>
+          <w:sz w:val="24"/>
+        </w:rPr>
+        <w:t>gives guests and Umrah tour operators advance notice</w:t>
+      </w:r>
+    </w:p>
+    <w:p>
+      <w:pPr>
+        <w:spacing w:after="80" w:before="0" w:line="276" w:lineRule="auto"/>
+        <w:ind w:left="418" w:hanging="259"/>
+        <w:jc w:val="both"/>
+      </w:pPr>
+      <w:r>
+        <w:rPr>
+          <w:rFonts w:ascii="Times New Roman" w:hAnsi="Times New Roman" w:cs="Times New Roman" w:eastAsia="Times New Roman"/>
+          <w:sz w:val="24"/>
+        </w:rPr>
+        <w:t xml:space="preserve">• </w:t>
+      </w:r>
+      <w:r>
+        <w:rPr>
+          <w:rFonts w:ascii="Times New Roman" w:hAnsi="Times New Roman" w:cs="Times New Roman" w:eastAsia="Times New Roman"/>
+          <w:sz w:val="24"/>
+        </w:rPr>
+        <w:t>trains front-line staff before reopening</w:t>
+      </w:r>
+    </w:p>
+    <w:p>
+      <w:pPr>
+        <w:spacing w:after="160" w:before="0" w:line="276" w:lineRule="auto"/>
         <w:jc w:val="both"/>
       </w:pPr>
       <w:r>
@@ -552,7 +1343,7 @@
           <w:i w:val="0"/>
           <w:sz w:val="24"/>
         </w:rPr>
-        <w:t>Hospitality projects such as opening a new hotel, renovating rooms, introducing a new property management system, or organizing a large event involve many stakeholders. Owners and investors are managed closely because they approve budgets and expect returns. Government and regulators, such as the Ministry of Tourism, the municipality, and civil defense, must be kept satisfied to obtain licenses and meet safety standards. Employees are involved and trained because they deliver the guest experience. Guests, online travel agencies, tour operators, and the local community are kept informed. For example, a hotel renovation near the Prophet’s Mosque in Al-Madinah can be scheduled outside the peak Umrah and Ramadan seasons, with early regulatory approvals and advance notice to guests and Umrah operators. This reduces disruption to guests, avoids regulatory delays, and supports the tourism goals of Saudi Vision 2030.</w:t>
+        <w:t>As a result, guests are less disturbed, regulatory delays are avoided, and the project supports the tourism goals of Saudi Vision 2030.</w:t>
       </w:r>
       <w:r>
         <w:br w:type="page"/>

</xml_diff>

<commit_message>
Add student name and ID; remove section line from cover
Co-Authored-By: Claude Opus 5.5 <noreply@anthropic.com>
Claude-Session: https://claude.ai/code/session_01CuowyRKknHJcUbt9phQMxj
</commit_message>
<xml_diff>
--- a/HMGT327_Assignment1_Stakeholder_Management.docx
+++ b/HMGT327_Assignment1_Stakeholder_Management.docx
@@ -171,7 +171,7 @@
           <w:b w:val="0"/>
           <w:sz w:val="24"/>
         </w:rPr>
-        <w:t>[Write your full name]</w:t>
+        <w:t>Bassam K. Altayran</w:t>
       </w:r>
     </w:p>
     <w:p>
@@ -200,7 +200,7 @@
           <w:b w:val="0"/>
           <w:sz w:val="24"/>
         </w:rPr>
-        <w:t>[Write your ID]</w:t>
+        <w:t>4411839</w:t>
       </w:r>
     </w:p>
     <w:p>
@@ -219,7 +219,7 @@
           <w:b/>
           <w:sz w:val="24"/>
         </w:rPr>
-        <w:t xml:space="preserve">Section No.: </w:t>
+        <w:t xml:space="preserve">Date of submission: </w:t>
       </w:r>
       <w:r>
         <w:rPr>
@@ -227,7 +227,7 @@
           <w:b w:val="0"/>
           <w:sz w:val="24"/>
         </w:rPr>
-        <w:t>[Write your section]</w:t>
+        <w:t>Saturday, 3 October 2026</w:t>
       </w:r>
     </w:p>
     <w:p>
@@ -240,24 +240,7 @@
           <w:szCs w:val="24"/>
         </w:rPr>
       </w:pPr>
-      <w:r>
-        <w:rPr>
-          <w:rFonts w:ascii="Times New Roman" w:hAnsi="Times New Roman" w:cs="Times New Roman" w:eastAsia="Times New Roman"/>
-          <w:b/>
-          <w:bCs/>
-          <w:sz w:val="24"/>
-          <w:szCs w:val="24"/>
-        </w:rPr>
-        <w:t xml:space="preserve">Date of submission: </w:t>
-      </w:r>
-      <w:r>
-        <w:rPr>
-          <w:rFonts w:ascii="Times New Roman" w:hAnsi="Times New Roman" w:cs="Times New Roman" w:eastAsia="Times New Roman"/>
-          <w:b w:val="0"/>
-          <w:sz w:val="24"/>
-        </w:rPr>
-        <w:t>Saturday, 3 October 2026</w:t>
-      </w:r>
+      <w:r/>
     </w:p>
     <w:p>
       <w:pPr>

</xml_diff>